<commit_message>
docs(eft): actualizar evidencia final de los pipelines
Reemplaza capturas y enlaces por las ejecuciones exitosas posteriores al endurecimiento de contenedores y a la actualizacion de GitHub Actions. Regenera los entregables Word, PDF y PowerPoint.
</commit_message>
<xml_diff>
--- a/docs/eft/Informe_EFT_Orioneta.docx
+++ b/docs/eft/Informe_EFT_Orioneta.docx
@@ -2152,7 +2152,7 @@
         <w:rPr/>
         <w:drawing>
           <wp:inline distT="0" distB="0" distL="0" distR="0">
-            <wp:extent cx="6120130" cy="5057775"/>
+            <wp:extent cx="6120130" cy="3933825"/>
             <wp:effectExtent l="0" t="0" r="0" b="0"/>
             <wp:docPr id="4" name="Image4" title="GitHub Actions frontend exitoso"/>
             <wp:cNvGraphicFramePr>
@@ -2176,7 +2176,7 @@
                   <pic:spPr bwMode="auto">
                     <a:xfrm>
                       <a:off x="0" y="0"/>
-                      <a:ext cx="6120130" cy="5057775"/>
+                      <a:ext cx="6120130" cy="3933825"/>
                     </a:xfrm>
                     <a:prstGeom prst="rect">
                       <a:avLst/>

</xml_diff>